<commit_message>
docs: add ASCII architecture diagram to section 2 of plane-track-doc.docx
</commit_message>
<xml_diff>
--- a/plane-track-doc.docx
+++ b/plane-track-doc.docx
@@ -77,7 +77,7 @@
         <w:spacing w:after="120"/>
       </w:pPr>
       <w:r>
-        <w:t xml:space="preserve">The pipeline follows a linear streaming architecture:</w:t>
+        <w:t xml:space="preserve">The diagram below shows the complete data flow from ADS-B ingestion to alert display, monitoring, and optional IBM ADS enrichment.</w:t>
       </w:r>
     </w:p>
     <w:p>
@@ -85,546 +85,939 @@
         <w:spacing w:after="160"/>
       </w:pPr>
     </w:p>
-    <w:tbl>
-      <w:tblPr>
-        <w:tblW w:w="100" w:type="auto"/>
-        <w:tblBorders>
-          <w:top w:val="single" w:color="auto" w:sz="4"/>
-          <w:left w:val="single" w:color="auto" w:sz="4"/>
-          <w:bottom w:val="single" w:color="auto" w:sz="4"/>
-          <w:right w:val="single" w:color="auto" w:sz="4"/>
-          <w:insideH w:val="single" w:color="auto" w:sz="4"/>
-          <w:insideV w:val="single" w:color="auto" w:sz="4"/>
-        </w:tblBorders>
-        <w:tblCellMar>
-          <w:top w:w="80" w:type="dxa"/>
-          <w:left w:w="160" w:type="dxa"/>
-          <w:bottom w:w="80" w:type="dxa"/>
-          <w:right w:w="160" w:type="dxa"/>
-        </w:tblCellMar>
-      </w:tblPr>
-      <w:tblGrid>
-        <w:gridCol w:w="1800"/>
-        <w:gridCol w:w="5760"/>
-        <w:gridCol w:w="1800"/>
-      </w:tblGrid>
-      <w:tr>
-        <w:trPr>
-          <w:tblHeader/>
-        </w:trPr>
-        <w:tc>
-          <w:tcPr>
-            <w:tcW w:w="1800" w:type="dxa"/>
-            <w:tcBorders>
-              <w:top w:val="single" w:color="CCCCCC" w:sz="1"/>
-              <w:left w:val="single" w:color="CCCCCC" w:sz="1"/>
-              <w:bottom w:val="single" w:color="CCCCCC" w:sz="1"/>
-              <w:right w:val="single" w:color="CCCCCC" w:sz="1"/>
-            </w:tcBorders>
-            <w:shd w:val="clear" w:fill="1B3A6B"/>
-            <w:vAlign w:val="center"/>
-          </w:tcPr>
-          <w:p>
-            <w:pPr>
-              <w:spacing w:after="60"/>
-            </w:pPr>
-            <w:r>
-              <w:rPr>
-                <w:b/>
-                <w:bCs/>
-                <w:sz w:val="20"/>
-                <w:szCs w:val="20"/>
-              </w:rPr>
-              <w:t xml:space="preserve">Component</w:t>
-            </w:r>
-          </w:p>
-        </w:tc>
-        <w:tc>
-          <w:tcPr>
-            <w:tcW w:w="5760" w:type="dxa"/>
-            <w:tcBorders>
-              <w:top w:val="single" w:color="CCCCCC" w:sz="1"/>
-              <w:left w:val="single" w:color="CCCCCC" w:sz="1"/>
-              <w:bottom w:val="single" w:color="CCCCCC" w:sz="1"/>
-              <w:right w:val="single" w:color="CCCCCC" w:sz="1"/>
-            </w:tcBorders>
-            <w:shd w:val="clear" w:fill="1B3A6B"/>
-            <w:vAlign w:val="center"/>
-          </w:tcPr>
-          <w:p>
-            <w:pPr>
-              <w:spacing w:after="60"/>
-            </w:pPr>
-            <w:r>
-              <w:rPr>
-                <w:b/>
-                <w:bCs/>
-                <w:sz w:val="20"/>
-                <w:szCs w:val="20"/>
-              </w:rPr>
-              <w:t xml:space="preserve">Role</w:t>
-            </w:r>
-          </w:p>
-        </w:tc>
-        <w:tc>
-          <w:tcPr>
-            <w:tcW w:w="1800" w:type="dxa"/>
-            <w:tcBorders>
-              <w:top w:val="single" w:color="CCCCCC" w:sz="1"/>
-              <w:left w:val="single" w:color="CCCCCC" w:sz="1"/>
-              <w:bottom w:val="single" w:color="CCCCCC" w:sz="1"/>
-              <w:right w:val="single" w:color="CCCCCC" w:sz="1"/>
-            </w:tcBorders>
-            <w:shd w:val="clear" w:fill="1B3A6B"/>
-            <w:vAlign w:val="center"/>
-          </w:tcPr>
-          <w:p>
-            <w:pPr>
-              <w:spacing w:after="60"/>
-            </w:pPr>
-            <w:r>
-              <w:rPr>
-                <w:b/>
-                <w:bCs/>
-                <w:sz w:val="20"/>
-                <w:szCs w:val="20"/>
-              </w:rPr>
-              <w:t xml:space="preserve">Technology</w:t>
-            </w:r>
-          </w:p>
-        </w:tc>
-      </w:tr>
-      <w:tr>
-        <w:trPr>
-          <w:tblHeader w:val="false"/>
-        </w:trPr>
-        <w:tc>
-          <w:tcPr>
-            <w:tcW w:w="1800" w:type="dxa"/>
-            <w:tcBorders>
-              <w:top w:val="single" w:color="CCCCCC" w:sz="1"/>
-              <w:left w:val="single" w:color="CCCCCC" w:sz="1"/>
-              <w:bottom w:val="single" w:color="CCCCCC" w:sz="1"/>
-              <w:right w:val="single" w:color="CCCCCC" w:sz="1"/>
-            </w:tcBorders>
-            <w:shd w:val="clear" w:fill="FFFFFF"/>
-            <w:vAlign w:val="center"/>
-          </w:tcPr>
-          <w:p>
-            <w:pPr>
-              <w:spacing w:after="60"/>
-            </w:pPr>
-            <w:r>
-              <w:rPr>
-                <w:b w:val="false"/>
-                <w:bCs w:val="false"/>
-                <w:sz w:val="22"/>
-                <w:szCs w:val="22"/>
-              </w:rPr>
-              <w:t xml:space="preserve">ADS-B Simulator</w:t>
-            </w:r>
-          </w:p>
-        </w:tc>
-        <w:tc>
-          <w:tcPr>
-            <w:tcW w:w="5760" w:type="dxa"/>
-            <w:tcBorders>
-              <w:top w:val="single" w:color="CCCCCC" w:sz="1"/>
-              <w:left w:val="single" w:color="CCCCCC" w:sz="1"/>
-              <w:bottom w:val="single" w:color="CCCCCC" w:sz="1"/>
-              <w:right w:val="single" w:color="CCCCCC" w:sz="1"/>
-            </w:tcBorders>
-            <w:shd w:val="clear" w:fill="FFFFFF"/>
-            <w:vAlign w:val="center"/>
-          </w:tcPr>
-          <w:p>
-            <w:pPr>
-              <w:spacing w:after="60"/>
-            </w:pPr>
-            <w:r>
-              <w:rPr>
-                <w:b w:val="false"/>
-                <w:bCs w:val="false"/>
-                <w:sz w:val="22"/>
-                <w:szCs w:val="22"/>
-              </w:rPr>
-              <w:t xml:space="preserve">Generates synthetic SIM* position events alternating Missed Approach and Twin Landing scenarios every ~30 s. Keeps pipeline active without real OpenSky credentials.</w:t>
-            </w:r>
-          </w:p>
-        </w:tc>
-        <w:tc>
-          <w:tcPr>
-            <w:tcW w:w="1800" w:type="dxa"/>
-            <w:tcBorders>
-              <w:top w:val="single" w:color="CCCCCC" w:sz="1"/>
-              <w:left w:val="single" w:color="CCCCCC" w:sz="1"/>
-              <w:bottom w:val="single" w:color="CCCCCC" w:sz="1"/>
-              <w:right w:val="single" w:color="CCCCCC" w:sz="1"/>
-            </w:tcBorders>
-            <w:shd w:val="clear" w:fill="FFFFFF"/>
-            <w:vAlign w:val="center"/>
-          </w:tcPr>
-          <w:p>
-            <w:pPr>
-              <w:spacing w:after="60"/>
-            </w:pPr>
-            <w:r>
-              <w:rPr>
-                <w:b w:val="false"/>
-                <w:bCs w:val="false"/>
-                <w:sz w:val="22"/>
-                <w:szCs w:val="22"/>
-              </w:rPr>
-              <w:t xml:space="preserve">Python 3.12</w:t>
-            </w:r>
-          </w:p>
-        </w:tc>
-      </w:tr>
-      <w:tr>
-        <w:trPr>
-          <w:tblHeader w:val="false"/>
-        </w:trPr>
-        <w:tc>
-          <w:tcPr>
-            <w:tcW w:w="1800" w:type="dxa"/>
-            <w:tcBorders>
-              <w:top w:val="single" w:color="CCCCCC" w:sz="1"/>
-              <w:left w:val="single" w:color="CCCCCC" w:sz="1"/>
-              <w:bottom w:val="single" w:color="CCCCCC" w:sz="1"/>
-              <w:right w:val="single" w:color="CCCCCC" w:sz="1"/>
-            </w:tcBorders>
-            <w:shd w:val="clear" w:fill="FFFBEB"/>
-            <w:vAlign w:val="center"/>
-          </w:tcPr>
-          <w:p>
-            <w:pPr>
-              <w:spacing w:after="60"/>
-            </w:pPr>
-            <w:r>
-              <w:rPr>
-                <w:b w:val="false"/>
-                <w:bCs w:val="false"/>
-                <w:sz w:val="22"/>
-                <w:szCs w:val="22"/>
-              </w:rPr>
-              <w:t xml:space="preserve">Kafka Broker</w:t>
-            </w:r>
-          </w:p>
-        </w:tc>
-        <w:tc>
-          <w:tcPr>
-            <w:tcW w:w="5760" w:type="dxa"/>
-            <w:tcBorders>
-              <w:top w:val="single" w:color="CCCCCC" w:sz="1"/>
-              <w:left w:val="single" w:color="CCCCCC" w:sz="1"/>
-              <w:bottom w:val="single" w:color="CCCCCC" w:sz="1"/>
-              <w:right w:val="single" w:color="CCCCCC" w:sz="1"/>
-            </w:tcBorders>
-            <w:shd w:val="clear" w:fill="FFFBEB"/>
-            <w:vAlign w:val="center"/>
-          </w:tcPr>
-          <w:p>
-            <w:pPr>
-              <w:spacing w:after="60"/>
-            </w:pPr>
-            <w:r>
-              <w:rPr>
-                <w:b w:val="false"/>
-                <w:bCs w:val="false"/>
-                <w:sz w:val="22"/>
-                <w:szCs w:val="22"/>
-              </w:rPr>
-              <w:t xml:space="preserve">Single-node KRaft broker. Receives raw ADS-B vectors on adsb_raw (4 partitions). CEP output written to ory_missed_approach and ory_twin_landing.</w:t>
-            </w:r>
-          </w:p>
-        </w:tc>
-        <w:tc>
-          <w:tcPr>
-            <w:tcW w:w="1800" w:type="dxa"/>
-            <w:tcBorders>
-              <w:top w:val="single" w:color="CCCCCC" w:sz="1"/>
-              <w:left w:val="single" w:color="CCCCCC" w:sz="1"/>
-              <w:bottom w:val="single" w:color="CCCCCC" w:sz="1"/>
-              <w:right w:val="single" w:color="CCCCCC" w:sz="1"/>
-            </w:tcBorders>
-            <w:shd w:val="clear" w:fill="FFFBEB"/>
-            <w:vAlign w:val="center"/>
-          </w:tcPr>
-          <w:p>
-            <w:pPr>
-              <w:spacing w:after="60"/>
-            </w:pPr>
-            <w:r>
-              <w:rPr>
-                <w:b w:val="false"/>
-                <w:bCs w:val="false"/>
-                <w:sz w:val="22"/>
-                <w:szCs w:val="22"/>
-              </w:rPr>
-              <w:t xml:space="preserve">Kafka 3.7 KRaft</w:t>
-            </w:r>
-          </w:p>
-        </w:tc>
-      </w:tr>
-      <w:tr>
-        <w:trPr>
-          <w:tblHeader w:val="false"/>
-        </w:trPr>
-        <w:tc>
-          <w:tcPr>
-            <w:tcW w:w="1800" w:type="dxa"/>
-            <w:tcBorders>
-              <w:top w:val="single" w:color="CCCCCC" w:sz="1"/>
-              <w:left w:val="single" w:color="CCCCCC" w:sz="1"/>
-              <w:bottom w:val="single" w:color="CCCCCC" w:sz="1"/>
-              <w:right w:val="single" w:color="CCCCCC" w:sz="1"/>
-            </w:tcBorders>
-            <w:shd w:val="clear" w:fill="FFFFFF"/>
-            <w:vAlign w:val="center"/>
-          </w:tcPr>
-          <w:p>
-            <w:pPr>
-              <w:spacing w:after="60"/>
-            </w:pPr>
-            <w:r>
-              <w:rPr>
-                <w:b w:val="false"/>
-                <w:bCs w:val="false"/>
-                <w:sz w:val="22"/>
-                <w:szCs w:val="22"/>
-              </w:rPr>
-              <w:t xml:space="preserve">Schema Registry</w:t>
-            </w:r>
-          </w:p>
-        </w:tc>
-        <w:tc>
-          <w:tcPr>
-            <w:tcW w:w="5760" w:type="dxa"/>
-            <w:tcBorders>
-              <w:top w:val="single" w:color="CCCCCC" w:sz="1"/>
-              <w:left w:val="single" w:color="CCCCCC" w:sz="1"/>
-              <w:bottom w:val="single" w:color="CCCCCC" w:sz="1"/>
-              <w:right w:val="single" w:color="CCCCCC" w:sz="1"/>
-            </w:tcBorders>
-            <w:shd w:val="clear" w:fill="FFFFFF"/>
-            <w:vAlign w:val="center"/>
-          </w:tcPr>
-          <w:p>
-            <w:pPr>
-              <w:spacing w:after="60"/>
-            </w:pPr>
-            <w:r>
-              <w:rPr>
-                <w:b w:val="false"/>
-                <w:bCs w:val="false"/>
-                <w:sz w:val="22"/>
-                <w:szCs w:val="22"/>
-              </w:rPr>
-              <w:t xml:space="preserve">Confluent Schema Registry for Avro schema management.</w:t>
-            </w:r>
-          </w:p>
-        </w:tc>
-        <w:tc>
-          <w:tcPr>
-            <w:tcW w:w="1800" w:type="dxa"/>
-            <w:tcBorders>
-              <w:top w:val="single" w:color="CCCCCC" w:sz="1"/>
-              <w:left w:val="single" w:color="CCCCCC" w:sz="1"/>
-              <w:bottom w:val="single" w:color="CCCCCC" w:sz="1"/>
-              <w:right w:val="single" w:color="CCCCCC" w:sz="1"/>
-            </w:tcBorders>
-            <w:shd w:val="clear" w:fill="FFFFFF"/>
-            <w:vAlign w:val="center"/>
-          </w:tcPr>
-          <w:p>
-            <w:pPr>
-              <w:spacing w:after="60"/>
-            </w:pPr>
-            <w:r>
-              <w:rPr>
-                <w:b w:val="false"/>
-                <w:bCs w:val="false"/>
-                <w:sz w:val="22"/>
-                <w:szCs w:val="22"/>
-              </w:rPr>
-              <w:t xml:space="preserve">Confluent 7.9</w:t>
-            </w:r>
-          </w:p>
-        </w:tc>
-      </w:tr>
-      <w:tr>
-        <w:trPr>
-          <w:tblHeader w:val="false"/>
-        </w:trPr>
-        <w:tc>
-          <w:tcPr>
-            <w:tcW w:w="1800" w:type="dxa"/>
-            <w:tcBorders>
-              <w:top w:val="single" w:color="CCCCCC" w:sz="1"/>
-              <w:left w:val="single" w:color="CCCCCC" w:sz="1"/>
-              <w:bottom w:val="single" w:color="CCCCCC" w:sz="1"/>
-              <w:right w:val="single" w:color="CCCCCC" w:sz="1"/>
-            </w:tcBorders>
-            <w:shd w:val="clear" w:fill="F0FDF4"/>
-            <w:vAlign w:val="center"/>
-          </w:tcPr>
-          <w:p>
-            <w:pPr>
-              <w:spacing w:after="60"/>
-            </w:pPr>
-            <w:r>
-              <w:rPr>
-                <w:b w:val="false"/>
-                <w:bCs w:val="false"/>
-                <w:sz w:val="22"/>
-                <w:szCs w:val="22"/>
-              </w:rPr>
-              <w:t xml:space="preserve">Flink CEP</w:t>
-            </w:r>
-          </w:p>
-        </w:tc>
-        <w:tc>
-          <w:tcPr>
-            <w:tcW w:w="5760" w:type="dxa"/>
-            <w:tcBorders>
-              <w:top w:val="single" w:color="CCCCCC" w:sz="1"/>
-              <w:left w:val="single" w:color="CCCCCC" w:sz="1"/>
-              <w:bottom w:val="single" w:color="CCCCCC" w:sz="1"/>
-              <w:right w:val="single" w:color="CCCCCC" w:sz="1"/>
-            </w:tcBorders>
-            <w:shd w:val="clear" w:fill="F0FDF4"/>
-            <w:vAlign w:val="center"/>
-          </w:tcPr>
-          <w:p>
-            <w:pPr>
-              <w:spacing w:after="60"/>
-            </w:pPr>
-            <w:r>
-              <w:rPr>
-                <w:b w:val="false"/>
-                <w:bCs w:val="false"/>
-                <w:sz w:val="22"/>
-                <w:szCs w:val="22"/>
-              </w:rPr>
-              <w:t xml:space="preserve">Flink SQL job consuming adsb_raw, applying MATCH_RECOGNIZE and TUMBLE window patterns to detect anomalies and publish alerts.</w:t>
-            </w:r>
-          </w:p>
-        </w:tc>
-        <w:tc>
-          <w:tcPr>
-            <w:tcW w:w="1800" w:type="dxa"/>
-            <w:tcBorders>
-              <w:top w:val="single" w:color="CCCCCC" w:sz="1"/>
-              <w:left w:val="single" w:color="CCCCCC" w:sz="1"/>
-              <w:bottom w:val="single" w:color="CCCCCC" w:sz="1"/>
-              <w:right w:val="single" w:color="CCCCCC" w:sz="1"/>
-            </w:tcBorders>
-            <w:shd w:val="clear" w:fill="F0FDF4"/>
-            <w:vAlign w:val="center"/>
-          </w:tcPr>
-          <w:p>
-            <w:pPr>
-              <w:spacing w:after="60"/>
-            </w:pPr>
-            <w:r>
-              <w:rPr>
-                <w:b w:val="false"/>
-                <w:bCs w:val="false"/>
-                <w:sz w:val="22"/>
-                <w:szCs w:val="22"/>
-              </w:rPr>
-              <w:t xml:space="preserve">Flink 1.19 SQL</w:t>
-            </w:r>
-          </w:p>
-        </w:tc>
-      </w:tr>
-      <w:tr>
-        <w:trPr>
-          <w:tblHeader w:val="false"/>
-        </w:trPr>
-        <w:tc>
-          <w:tcPr>
-            <w:tcW w:w="1800" w:type="dxa"/>
-            <w:tcBorders>
-              <w:top w:val="single" w:color="CCCCCC" w:sz="1"/>
-              <w:left w:val="single" w:color="CCCCCC" w:sz="1"/>
-              <w:bottom w:val="single" w:color="CCCCCC" w:sz="1"/>
-              <w:right w:val="single" w:color="CCCCCC" w:sz="1"/>
-            </w:tcBorders>
-            <w:shd w:val="clear" w:fill="FFFFFF"/>
-            <w:vAlign w:val="center"/>
-          </w:tcPr>
-          <w:p>
-            <w:pPr>
-              <w:spacing w:after="60"/>
-            </w:pPr>
-            <w:r>
-              <w:rPr>
-                <w:b w:val="false"/>
-                <w:bCs w:val="false"/>
-                <w:sz w:val="22"/>
-                <w:szCs w:val="22"/>
-              </w:rPr>
-              <w:t xml:space="preserve">Dashboard</w:t>
-            </w:r>
-          </w:p>
-        </w:tc>
-        <w:tc>
-          <w:tcPr>
-            <w:tcW w:w="5760" w:type="dxa"/>
-            <w:tcBorders>
-              <w:top w:val="single" w:color="CCCCCC" w:sz="1"/>
-              <w:left w:val="single" w:color="CCCCCC" w:sz="1"/>
-              <w:bottom w:val="single" w:color="CCCCCC" w:sz="1"/>
-              <w:right w:val="single" w:color="CCCCCC" w:sz="1"/>
-            </w:tcBorders>
-            <w:shd w:val="clear" w:fill="FFFFFF"/>
-            <w:vAlign w:val="center"/>
-          </w:tcPr>
-          <w:p>
-            <w:pPr>
-              <w:spacing w:after="60"/>
-            </w:pPr>
-            <w:r>
-              <w:rPr>
-                <w:b w:val="false"/>
-                <w:bCs w:val="false"/>
-                <w:sz w:val="22"/>
-                <w:szCs w:val="22"/>
-              </w:rPr>
-              <w:t xml:space="preserve">Flask web app consuming alert topics and adsb_raw. Exposes three tabs: Live Alerts, Flight Feed, and About. Accessible via OpenShift Route (TLS edge).</w:t>
-            </w:r>
-          </w:p>
-        </w:tc>
-        <w:tc>
-          <w:tcPr>
-            <w:tcW w:w="1800" w:type="dxa"/>
-            <w:tcBorders>
-              <w:top w:val="single" w:color="CCCCCC" w:sz="1"/>
-              <w:left w:val="single" w:color="CCCCCC" w:sz="1"/>
-              <w:bottom w:val="single" w:color="CCCCCC" w:sz="1"/>
-              <w:right w:val="single" w:color="CCCCCC" w:sz="1"/>
-            </w:tcBorders>
-            <w:shd w:val="clear" w:fill="FFFFFF"/>
-            <w:vAlign w:val="center"/>
-          </w:tcPr>
-          <w:p>
-            <w:pPr>
-              <w:spacing w:after="60"/>
-            </w:pPr>
-            <w:r>
-              <w:rPr>
-                <w:b w:val="false"/>
-                <w:bCs w:val="false"/>
-                <w:sz w:val="22"/>
-                <w:szCs w:val="22"/>
-              </w:rPr>
-              <w:t xml:space="preserve">Python / Flask</w:t>
-            </w:r>
-          </w:p>
-        </w:tc>
-      </w:tr>
-    </w:tbl>
+    <w:p>
+      <w:pPr>
+        <w:spacing w:before="0" w:after="120"/>
+      </w:pPr>
+      <w:r>
+        <w:rPr>
+          <w:rFonts w:ascii="Courier New" w:hAnsi="Courier New" w:eastAsia="Courier New"/>
+          <w:sz w:val="18"/>
+        </w:rPr>
+        <w:t xml:space="preserve">              uid: plane-track  31 panels</w:t>
+      </w:r>
+    </w:p>
+    <w:p>
+      <w:pPr>
+        <w:spacing w:before="0" w:after="0"/>
+      </w:pPr>
+      <w:r>
+        <w:rPr>
+          <w:rFonts w:ascii="Courier New" w:hAnsi="Courier New" w:eastAsia="Courier New"/>
+          <w:sz w:val="18"/>
+        </w:rPr>
+        <w:t xml:space="preserve">              Grafana :3000  (test-app ns)</w:t>
+      </w:r>
+    </w:p>
+    <w:p>
+      <w:pPr>
+        <w:spacing w:before="0" w:after="0"/>
+      </w:pPr>
+      <w:r>
+        <w:rPr>
+          <w:rFonts w:ascii="Courier New" w:hAnsi="Courier New" w:eastAsia="Courier New"/>
+          <w:sz w:val="18"/>
+        </w:rPr>
+        <w:t xml:space="preserve">                       v</w:t>
+      </w:r>
+    </w:p>
+    <w:p>
+      <w:pPr>
+        <w:spacing w:before="0" w:after="0"/>
+      </w:pPr>
+      <w:r>
+        <w:rPr>
+          <w:rFonts w:ascii="Courier New" w:hAnsi="Courier New" w:eastAsia="Courier New"/>
+          <w:sz w:val="18"/>
+        </w:rPr>
+        <w:t xml:space="preserve">                       |</w:t>
+      </w:r>
+    </w:p>
+    <w:p>
+      <w:pPr>
+        <w:spacing w:before="0" w:after="0"/>
+      </w:pPr>
+      <w:r>
+        <w:rPr>
+          <w:rFonts w:ascii="Courier New" w:hAnsi="Courier New" w:eastAsia="Courier New"/>
+          <w:sz w:val="18"/>
+        </w:rPr>
+        <w:t xml:space="preserve">              prometheus-proxy :9099 (test-app)</w:t>
+      </w:r>
+    </w:p>
+    <w:p>
+      <w:pPr>
+        <w:spacing w:before="0" w:after="0"/>
+      </w:pPr>
+      <w:r>
+        <w:rPr>
+          <w:rFonts w:ascii="Courier New" w:hAnsi="Courier New" w:eastAsia="Courier New"/>
+          <w:sz w:val="18"/>
+        </w:rPr>
+        <w:t xml:space="preserve">                       v</w:t>
+      </w:r>
+    </w:p>
+    <w:p>
+      <w:pPr>
+        <w:spacing w:before="0" w:after="0"/>
+      </w:pPr>
+      <w:r>
+        <w:rPr>
+          <w:rFonts w:ascii="Courier New" w:hAnsi="Courier New" w:eastAsia="Courier New"/>
+          <w:sz w:val="18"/>
+        </w:rPr>
+        <w:t xml:space="preserve">                       |</w:t>
+      </w:r>
+    </w:p>
+    <w:p>
+      <w:pPr>
+        <w:spacing w:before="0" w:after="0"/>
+      </w:pPr>
+      <w:r>
+        <w:rPr>
+          <w:rFonts w:ascii="Courier New" w:hAnsi="Courier New" w:eastAsia="Courier New"/>
+          <w:sz w:val="18"/>
+        </w:rPr>
+        <w:t xml:space="preserve">              Thanos Sidecar -&gt; Thanos Querier</w:t>
+      </w:r>
+    </w:p>
+    <w:p>
+      <w:pPr>
+        <w:spacing w:before="0" w:after="0"/>
+      </w:pPr>
+      <w:r>
+        <w:rPr>
+          <w:rFonts w:ascii="Courier New" w:hAnsi="Courier New" w:eastAsia="Courier New"/>
+          <w:sz w:val="18"/>
+        </w:rPr>
+        <w:t xml:space="preserve">                       v</w:t>
+      </w:r>
+    </w:p>
+    <w:p>
+      <w:pPr>
+        <w:spacing w:before="0" w:after="0"/>
+      </w:pPr>
+      <w:r>
+        <w:rPr>
+          <w:rFonts w:ascii="Courier New" w:hAnsi="Courier New" w:eastAsia="Courier New"/>
+          <w:sz w:val="18"/>
+        </w:rPr>
+        <w:t xml:space="preserve">                       |</w:t>
+      </w:r>
+    </w:p>
+    <w:p>
+      <w:pPr>
+        <w:spacing w:before="0" w:after="0"/>
+      </w:pPr>
+      <w:r>
+        <w:rPr>
+          <w:rFonts w:ascii="Courier New" w:hAnsi="Courier New" w:eastAsia="Courier New"/>
+          <w:sz w:val="18"/>
+        </w:rPr>
+        <w:t xml:space="preserve">               scrape /metrics every 15s</w:t>
+      </w:r>
+    </w:p>
+    <w:p>
+      <w:pPr>
+        <w:spacing w:before="0" w:after="0"/>
+      </w:pPr>
+      <w:r>
+        <w:rPr>
+          <w:rFonts w:ascii="Courier New" w:hAnsi="Courier New" w:eastAsia="Courier New"/>
+          <w:sz w:val="18"/>
+        </w:rPr>
+        <w:t xml:space="preserve">               Prometheus user-workload</w:t>
+      </w:r>
+    </w:p>
+    <w:p>
+      <w:pPr>
+        <w:spacing w:before="0" w:after="0"/>
+      </w:pPr>
+      <w:r>
+        <w:rPr>
+          <w:rFonts w:ascii="Courier New" w:hAnsi="Courier New" w:eastAsia="Courier New"/>
+          <w:sz w:val="18"/>
+        </w:rPr>
+        <w:t xml:space="preserve">                       v</w:t>
+      </w:r>
+    </w:p>
+    <w:p>
+      <w:pPr>
+        <w:spacing w:before="0" w:after="0"/>
+      </w:pPr>
+      <w:r>
+        <w:rPr>
+          <w:rFonts w:ascii="Courier New" w:hAnsi="Courier New" w:eastAsia="Courier New"/>
+          <w:sz w:val="18"/>
+        </w:rPr>
+        <w:t xml:space="preserve">                       |           Flink UI</w:t>
+      </w:r>
+    </w:p>
+    <w:p>
+      <w:pPr>
+        <w:spacing w:before="0" w:after="0"/>
+      </w:pPr>
+      <w:r>
+        <w:rPr>
+          <w:rFonts w:ascii="Courier New" w:hAnsi="Courier New" w:eastAsia="Courier New"/>
+          <w:sz w:val="18"/>
+        </w:rPr>
+        <w:t xml:space="preserve">        (Route)   plane-track ns  Route      :9081</w:t>
+      </w:r>
+    </w:p>
+    <w:p>
+      <w:pPr>
+        <w:spacing w:before="0" w:after="0"/>
+      </w:pPr>
+      <w:r>
+        <w:rPr>
+          <w:rFonts w:ascii="Courier New" w:hAnsi="Courier New" w:eastAsia="Courier New"/>
+          <w:sz w:val="18"/>
+        </w:rPr>
+        <w:t xml:space="preserve">        Browser   ServiceMonitor  OpenShift  Flink REST</w:t>
+      </w:r>
+    </w:p>
+    <w:p>
+      <w:pPr>
+        <w:spacing w:before="0" w:after="0"/>
+      </w:pPr>
+      <w:r>
+        <w:rPr>
+          <w:rFonts w:ascii="Courier New" w:hAnsi="Courier New" w:eastAsia="Courier New"/>
+          <w:sz w:val="18"/>
+        </w:rPr>
+        <w:t xml:space="preserve">           v         v             v           v</w:t>
+      </w:r>
+    </w:p>
+    <w:p>
+      <w:pPr>
+        <w:spacing w:before="0" w:after="0"/>
+      </w:pPr>
+      <w:r>
+        <w:rPr>
+          <w:rFonts w:ascii="Courier New" w:hAnsi="Courier New" w:eastAsia="Courier New"/>
+          <w:sz w:val="18"/>
+        </w:rPr>
+        <w:t xml:space="preserve">           |         |             |           |</w:t>
+      </w:r>
+    </w:p>
+    <w:p>
+      <w:pPr>
+        <w:spacing w:before="0" w:after="0"/>
+      </w:pPr>
+      <w:r>
+        <w:rPr>
+          <w:rFonts w:ascii="Courier New" w:hAnsi="Courier New" w:eastAsia="Courier New"/>
+          <w:sz w:val="18"/>
+        </w:rPr>
+        <w:t xml:space="preserve">           +---------+-----+-------+-----------+</w:t>
+      </w:r>
+    </w:p>
+    <w:p>
+      <w:pPr>
+        <w:spacing w:before="0" w:after="0"/>
+      </w:pPr>
+      <w:r>
+        <w:rPr>
+          <w:rFonts w:ascii="Courier New" w:hAnsi="Courier New" w:eastAsia="Courier New"/>
+          <w:sz w:val="18"/>
+        </w:rPr>
+        <w:t xml:space="preserve">                           |</w:t>
+      </w:r>
+    </w:p>
+    <w:p>
+      <w:pPr>
+        <w:spacing w:before="0" w:after="0"/>
+      </w:pPr>
+      <w:r>
+        <w:rPr>
+          <w:rFonts w:ascii="Courier New" w:hAnsi="Courier New" w:eastAsia="Courier New"/>
+          <w:sz w:val="18"/>
+        </w:rPr>
+        <w:t xml:space="preserve">           +---------------+---------------+</w:t>
+      </w:r>
+    </w:p>
+    <w:p>
+      <w:pPr>
+        <w:spacing w:before="0" w:after="0"/>
+      </w:pPr>
+      <w:r>
+        <w:rPr>
+          <w:rFonts w:ascii="Courier New" w:hAnsi="Courier New" w:eastAsia="Courier New"/>
+          <w:sz w:val="18"/>
+        </w:rPr>
+        <w:t xml:space="preserve">           |  GET /metrics  (Prometheus)    |</w:t>
+      </w:r>
+    </w:p>
+    <w:p>
+      <w:pPr>
+        <w:spacing w:before="0" w:after="0"/>
+      </w:pPr>
+      <w:r>
+        <w:rPr>
+          <w:rFonts w:ascii="Courier New" w:hAnsi="Courier New" w:eastAsia="Courier New"/>
+          <w:sz w:val="18"/>
+        </w:rPr>
+        <w:t xml:space="preserve">           |  GET /api/tracker              |</w:t>
+      </w:r>
+    </w:p>
+    <w:p>
+      <w:pPr>
+        <w:spacing w:before="0" w:after="0"/>
+      </w:pPr>
+      <w:r>
+        <w:rPr>
+          <w:rFonts w:ascii="Courier New" w:hAnsi="Courier New" w:eastAsia="Courier New"/>
+          <w:sz w:val="18"/>
+        </w:rPr>
+        <w:t xml:space="preserve">           |  GET /api/raw                  |</w:t>
+      </w:r>
+    </w:p>
+    <w:p>
+      <w:pPr>
+        <w:spacing w:before="0" w:after="0"/>
+      </w:pPr>
+      <w:r>
+        <w:rPr>
+          <w:rFonts w:ascii="Courier New" w:hAnsi="Courier New" w:eastAsia="Courier New"/>
+          <w:sz w:val="18"/>
+        </w:rPr>
+        <w:t xml:space="preserve">           |  GET /api/alerts               |</w:t>
+      </w:r>
+    </w:p>
+    <w:p>
+      <w:pPr>
+        <w:spacing w:before="0" w:after="0"/>
+      </w:pPr>
+      <w:r>
+        <w:rPr>
+          <w:rFonts w:ascii="Courier New" w:hAnsi="Courier New" w:eastAsia="Courier New"/>
+          <w:sz w:val="18"/>
+        </w:rPr>
+        <w:t xml:space="preserve">           |  GET /           (5-tab UI)    |</w:t>
+      </w:r>
+    </w:p>
+    <w:p>
+      <w:pPr>
+        <w:spacing w:before="0" w:after="0"/>
+      </w:pPr>
+      <w:r>
+        <w:rPr>
+          <w:rFonts w:ascii="Courier New" w:hAnsi="Courier New" w:eastAsia="Courier New"/>
+          <w:sz w:val="18"/>
+        </w:rPr>
+        <w:t xml:space="preserve">           |  Routes:                       |</w:t>
+      </w:r>
+    </w:p>
+    <w:p>
+      <w:pPr>
+        <w:spacing w:before="0" w:after="0"/>
+      </w:pPr>
+      <w:r>
+        <w:rPr>
+          <w:rFonts w:ascii="Courier New" w:hAnsi="Courier New" w:eastAsia="Courier New"/>
+          <w:sz w:val="18"/>
+        </w:rPr>
+        <w:t xml:space="preserve">           |  +---------------------------+  |</w:t>
+      </w:r>
+    </w:p>
+    <w:p>
+      <w:pPr>
+        <w:spacing w:before="0" w:after="0"/>
+      </w:pPr>
+      <w:r>
+        <w:rPr>
+          <w:rFonts w:ascii="Courier New" w:hAnsi="Courier New" w:eastAsia="Courier New"/>
+          <w:sz w:val="18"/>
+        </w:rPr>
+        <w:t xml:space="preserve">           |  | severity + action badges  |  |</w:t>
+      </w:r>
+    </w:p>
+    <w:p>
+      <w:pPr>
+        <w:spacing w:before="0" w:after="0"/>
+      </w:pPr>
+      <w:r>
+        <w:rPr>
+          <w:rFonts w:ascii="Courier New" w:hAnsi="Courier New" w:eastAsia="Courier New"/>
+          <w:sz w:val="18"/>
+        </w:rPr>
+        <w:t xml:space="preserve">           |  | IBM ADS runtime POST/3s   |  |</w:t>
+      </w:r>
+    </w:p>
+    <w:p>
+      <w:pPr>
+        <w:spacing w:before="0" w:after="0"/>
+      </w:pPr>
+      <w:r>
+        <w:rPr>
+          <w:rFonts w:ascii="Courier New" w:hAnsi="Courier New" w:eastAsia="Courier New"/>
+          <w:sz w:val="18"/>
+        </w:rPr>
+        <w:t xml:space="preserve">           |  | _classify_with_ads (ADS?) |  |  &lt;- optional</w:t>
+      </w:r>
+    </w:p>
+    <w:p>
+      <w:pPr>
+        <w:spacing w:before="0" w:after="0"/>
+      </w:pPr>
+      <w:r>
+        <w:rPr>
+          <w:rFonts w:ascii="Courier New" w:hAnsi="Courier New" w:eastAsia="Courier New"/>
+          <w:sz w:val="18"/>
+        </w:rPr>
+        <w:t xml:space="preserve">           |  +---------------------------+  |</w:t>
+      </w:r>
+    </w:p>
+    <w:p>
+      <w:pPr>
+        <w:spacing w:before="0" w:after="0"/>
+      </w:pPr>
+      <w:r>
+        <w:rPr>
+          <w:rFonts w:ascii="Courier New" w:hAnsi="Courier New" w:eastAsia="Courier New"/>
+          <w:sz w:val="18"/>
+        </w:rPr>
+        <w:t xml:space="preserve">           |  +---------------------------+  |</w:t>
+      </w:r>
+    </w:p>
+    <w:p>
+      <w:pPr>
+        <w:spacing w:before="0" w:after="0"/>
+      </w:pPr>
+      <w:r>
+        <w:rPr>
+          <w:rFonts w:ascii="Courier New" w:hAnsi="Courier New" w:eastAsia="Courier New"/>
+          <w:sz w:val="18"/>
+        </w:rPr>
+        <w:t xml:space="preserve">           |  | OpenSky /states (60s)      |  |</w:t>
+      </w:r>
+    </w:p>
+    <w:p>
+      <w:pPr>
+        <w:spacing w:before="0" w:after="0"/>
+      </w:pPr>
+      <w:r>
+        <w:rPr>
+          <w:rFonts w:ascii="Courier New" w:hAnsi="Courier New" w:eastAsia="Courier New"/>
+          <w:sz w:val="18"/>
+        </w:rPr>
+        <w:t xml:space="preserve">           |  | _tracker_fetch_loop        |  |  &lt;- thread</w:t>
+      </w:r>
+    </w:p>
+    <w:p>
+      <w:pPr>
+        <w:spacing w:before="0" w:after="0"/>
+      </w:pPr>
+      <w:r>
+        <w:rPr>
+          <w:rFonts w:ascii="Courier New" w:hAnsi="Courier New" w:eastAsia="Courier New"/>
+          <w:sz w:val="18"/>
+        </w:rPr>
+        <w:t xml:space="preserve">           |  +---------------------------+  |</w:t>
+      </w:r>
+    </w:p>
+    <w:p>
+      <w:pPr>
+        <w:spacing w:before="0" w:after="0"/>
+      </w:pPr>
+      <w:r>
+        <w:rPr>
+          <w:rFonts w:ascii="Courier New" w:hAnsi="Courier New" w:eastAsia="Courier New"/>
+          <w:sz w:val="18"/>
+        </w:rPr>
+        <w:t xml:space="preserve">           |  +---------+  +------------+  |</w:t>
+      </w:r>
+    </w:p>
+    <w:p>
+      <w:pPr>
+        <w:spacing w:before="0" w:after="0"/>
+      </w:pPr>
+      <w:r>
+        <w:rPr>
+          <w:rFonts w:ascii="Courier New" w:hAnsi="Courier New" w:eastAsia="Courier New"/>
+          <w:sz w:val="18"/>
+        </w:rPr>
+        <w:t xml:space="preserve">           |  | deque200|  | deque200   |  |</w:t>
+      </w:r>
+    </w:p>
+    <w:p>
+      <w:pPr>
+        <w:spacing w:before="0" w:after="0"/>
+      </w:pPr>
+      <w:r>
+        <w:rPr>
+          <w:rFonts w:ascii="Courier New" w:hAnsi="Courier New" w:eastAsia="Courier New"/>
+          <w:sz w:val="18"/>
+        </w:rPr>
+        <w:t xml:space="preserve">           |  | dedup   |  | adsb_raw   |  |</w:t>
+      </w:r>
+    </w:p>
+    <w:p>
+      <w:pPr>
+        <w:spacing w:before="0" w:after="0"/>
+      </w:pPr>
+      <w:r>
+        <w:rPr>
+          <w:rFonts w:ascii="Courier New" w:hAnsi="Courier New" w:eastAsia="Courier New"/>
+          <w:sz w:val="18"/>
+        </w:rPr>
+        <w:t xml:space="preserve">           |  |_consume |  |_consume_raw|  |  &lt;- threads</w:t>
+      </w:r>
+    </w:p>
+    <w:p>
+      <w:pPr>
+        <w:spacing w:before="0" w:after="0"/>
+      </w:pPr>
+      <w:r>
+        <w:rPr>
+          <w:rFonts w:ascii="Courier New" w:hAnsi="Courier New" w:eastAsia="Courier New"/>
+          <w:sz w:val="18"/>
+        </w:rPr>
+        <w:t xml:space="preserve">           |  +---------+  +------------+  |</w:t>
+      </w:r>
+    </w:p>
+    <w:p>
+      <w:pPr>
+        <w:spacing w:before="0" w:after="0"/>
+      </w:pPr>
+      <w:r>
+        <w:rPr>
+          <w:rFonts w:ascii="Courier New" w:hAnsi="Courier New" w:eastAsia="Courier New"/>
+          <w:sz w:val="18"/>
+        </w:rPr>
+        <w:t xml:space="preserve">           |  Flask :8080  (plane-track ns) |</w:t>
+      </w:r>
+    </w:p>
+    <w:p>
+      <w:pPr>
+        <w:spacing w:before="0" w:after="0"/>
+      </w:pPr>
+      <w:r>
+        <w:rPr>
+          <w:rFonts w:ascii="Courier New" w:hAnsi="Courier New" w:eastAsia="Courier New"/>
+          <w:sz w:val="18"/>
+        </w:rPr>
+        <w:t xml:space="preserve">           |     alerts-dashboard           |</w:t>
+      </w:r>
+    </w:p>
+    <w:p>
+      <w:pPr>
+        <w:spacing w:before="0" w:after="0"/>
+      </w:pPr>
+      <w:r>
+        <w:rPr>
+          <w:rFonts w:ascii="Courier New" w:hAnsi="Courier New" w:eastAsia="Courier New"/>
+          <w:sz w:val="18"/>
+        </w:rPr>
+        <w:t xml:space="preserve">           +-------------------------------+</w:t>
+      </w:r>
+    </w:p>
+    <w:p>
+      <w:pPr>
+        <w:spacing w:before="0" w:after="0"/>
+      </w:pPr>
+      <w:r>
+        <w:rPr>
+          <w:rFonts w:ascii="Courier New" w:hAnsi="Courier New" w:eastAsia="Courier New"/>
+          <w:sz w:val="18"/>
+        </w:rPr>
+        <w:t xml:space="preserve">                           v</w:t>
+      </w:r>
+    </w:p>
+    <w:p>
+      <w:pPr>
+        <w:spacing w:before="0" w:after="0"/>
+      </w:pPr>
+      <w:r>
+        <w:rPr>
+          <w:rFonts w:ascii="Courier New" w:hAnsi="Courier New" w:eastAsia="Courier New"/>
+          <w:sz w:val="18"/>
+        </w:rPr>
+        <w:t xml:space="preserve">                           |  consume (5 topics)</w:t>
+      </w:r>
+    </w:p>
+    <w:p>
+      <w:pPr>
+        <w:spacing w:before="0" w:after="0"/>
+      </w:pPr>
+      <w:r>
+        <w:rPr>
+          <w:rFonts w:ascii="Courier New" w:hAnsi="Courier New" w:eastAsia="Courier New"/>
+          <w:sz w:val="18"/>
+        </w:rPr>
+        <w:t xml:space="preserve">     +---------------------+----------------------------+</w:t>
+      </w:r>
+    </w:p>
+    <w:p>
+      <w:pPr>
+        <w:spacing w:before="0" w:after="0"/>
+      </w:pPr>
+      <w:r>
+        <w:rPr>
+          <w:rFonts w:ascii="Courier New" w:hAnsi="Courier New" w:eastAsia="Courier New"/>
+          <w:sz w:val="18"/>
+        </w:rPr>
+        <w:t xml:space="preserve">     |                     |                            |</w:t>
+      </w:r>
+    </w:p>
+    <w:p>
+      <w:pPr>
+        <w:spacing w:before="0" w:after="0"/>
+      </w:pPr>
+      <w:r>
+        <w:rPr>
+          <w:rFonts w:ascii="Courier New" w:hAnsi="Courier New" w:eastAsia="Courier New"/>
+          <w:sz w:val="18"/>
+        </w:rPr>
+        <w:t xml:space="preserve">     |   Go-Around          |                            |</w:t>
+      </w:r>
+    </w:p>
+    <w:p>
+      <w:pPr>
+        <w:spacing w:before="0" w:after="0"/>
+      </w:pPr>
+      <w:r>
+        <w:rPr>
+          <w:rFonts w:ascii="Courier New" w:hAnsi="Courier New" w:eastAsia="Courier New"/>
+          <w:sz w:val="18"/>
+        </w:rPr>
+        <w:t xml:space="preserve">     |   Repeated        ory_repeated_goaround           |</w:t>
+      </w:r>
+    </w:p>
+    <w:p>
+      <w:pPr>
+        <w:spacing w:before="0" w:after="0"/>
+      </w:pPr>
+      <w:r>
+        <w:rPr>
+          <w:rFonts w:ascii="Courier New" w:hAnsi="Courier New" w:eastAsia="Courier New"/>
+          <w:sz w:val="18"/>
+        </w:rPr>
+        <w:t xml:space="preserve">     +--- [cep5] ----+  &lt;-- self-join on ory_missed_appr |</w:t>
+      </w:r>
+    </w:p>
+    <w:p>
+      <w:pPr>
+        <w:spacing w:before="0" w:after="0"/>
+      </w:pPr>
+      <w:r>
+        <w:rPr>
+          <w:rFonts w:ascii="Courier New" w:hAnsi="Courier New" w:eastAsia="Courier New"/>
+          <w:sz w:val="18"/>
+        </w:rPr>
+        <w:t xml:space="preserve">     |               |                                   |</w:t>
+      </w:r>
+    </w:p>
+    <w:p>
+      <w:pPr>
+        <w:spacing w:before="0" w:after="0"/>
+      </w:pPr>
+      <w:r>
+        <w:rPr>
+          <w:rFonts w:ascii="Courier New" w:hAnsi="Courier New" w:eastAsia="Courier New"/>
+          <w:sz w:val="18"/>
+        </w:rPr>
+        <w:t xml:space="preserve">     |            ory_twin_landing                       |</w:t>
+      </w:r>
+    </w:p>
+    <w:p>
+      <w:pPr>
+        <w:spacing w:before="0" w:after="0"/>
+      </w:pPr>
+      <w:r>
+        <w:rPr>
+          <w:rFonts w:ascii="Courier New" w:hAnsi="Courier New" w:eastAsia="Courier New"/>
+          <w:sz w:val="18"/>
+        </w:rPr>
+        <w:t xml:space="preserve">     |               v                                  |</w:t>
+      </w:r>
+    </w:p>
+    <w:p>
+      <w:pPr>
+        <w:spacing w:before="0" w:after="0"/>
+      </w:pPr>
+      <w:r>
+        <w:rPr>
+          <w:rFonts w:ascii="Courier New" w:hAnsi="Courier New" w:eastAsia="Courier New"/>
+          <w:sz w:val="18"/>
+        </w:rPr>
+        <w:t xml:space="preserve">     |               |  ory_rapid_descent  ory_corridor_overload</w:t>
+      </w:r>
+    </w:p>
+    <w:p>
+      <w:pPr>
+        <w:spacing w:before="0" w:after="0"/>
+      </w:pPr>
+      <w:r>
+        <w:rPr>
+          <w:rFonts w:ascii="Courier New" w:hAnsi="Courier New" w:eastAsia="Courier New"/>
+          <w:sz w:val="18"/>
+        </w:rPr>
+        <w:t xml:space="preserve">  ory_missed_appr    |     v                v</w:t>
+      </w:r>
+    </w:p>
+    <w:p>
+      <w:pPr>
+        <w:spacing w:before="0" w:after="0"/>
+      </w:pPr>
+      <w:r>
+        <w:rPr>
+          <w:rFonts w:ascii="Courier New" w:hAnsi="Courier New" w:eastAsia="Courier New"/>
+          <w:sz w:val="18"/>
+        </w:rPr>
+        <w:t xml:space="preserve">     v               |     |                |   produce to Kafka</w:t>
+      </w:r>
+    </w:p>
+    <w:p>
+      <w:pPr>
+        <w:spacing w:before="0" w:after="0"/>
+      </w:pPr>
+      <w:r>
+        <w:rPr>
+          <w:rFonts w:ascii="Courier New" w:hAnsi="Courier New" w:eastAsia="Courier New"/>
+          <w:sz w:val="18"/>
+        </w:rPr>
+        <w:t xml:space="preserve">     |               |     |                |</w:t>
+      </w:r>
+    </w:p>
+    <w:p>
+      <w:pPr>
+        <w:spacing w:before="0" w:after="0"/>
+      </w:pPr>
+      <w:r>
+        <w:rPr>
+          <w:rFonts w:ascii="Courier New" w:hAnsi="Courier New" w:eastAsia="Courier New"/>
+          <w:sz w:val="18"/>
+        </w:rPr>
+        <w:t xml:space="preserve">  Approach        Landng Descent        Overload</w:t>
+      </w:r>
+    </w:p>
+    <w:p>
+      <w:pPr>
+        <w:spacing w:before="0" w:after="0"/>
+      </w:pPr>
+      <w:r>
+        <w:rPr>
+          <w:rFonts w:ascii="Courier New" w:hAnsi="Courier New" w:eastAsia="Courier New"/>
+          <w:sz w:val="18"/>
+        </w:rPr>
+        <w:t xml:space="preserve">  Missed           Twin  Rapid          Corridor</w:t>
+      </w:r>
+    </w:p>
+    <w:p>
+      <w:pPr>
+        <w:spacing w:before="0" w:after="0"/>
+      </w:pPr>
+      <w:r>
+        <w:rPr>
+          <w:rFonts w:ascii="Courier New" w:hAnsi="Courier New" w:eastAsia="Courier New"/>
+          <w:sz w:val="18"/>
+        </w:rPr>
+        <w:t xml:space="preserve">  [cep1]          [cep2][cep3]         [cep4]</w:t>
+      </w:r>
+    </w:p>
+    <w:p>
+      <w:pPr>
+        <w:spacing w:before="0" w:after="0"/>
+      </w:pPr>
+      <w:r>
+        <w:rPr>
+          <w:rFonts w:ascii="Courier New" w:hAnsi="Courier New" w:eastAsia="Courier New"/>
+          <w:sz w:val="18"/>
+        </w:rPr>
+        <w:t xml:space="preserve">        v           v    v                v</w:t>
+      </w:r>
+    </w:p>
+    <w:p>
+      <w:pPr>
+        <w:spacing w:before="0" w:after="0"/>
+      </w:pPr>
+      <w:r>
+        <w:rPr>
+          <w:rFonts w:ascii="Courier New" w:hAnsi="Courier New" w:eastAsia="Courier New"/>
+          <w:sz w:val="18"/>
+        </w:rPr>
+        <w:t xml:space="preserve">        +-------+  +-+  +-+  +-----------+</w:t>
+      </w:r>
+    </w:p>
+    <w:p>
+      <w:pPr>
+        <w:spacing w:before="0" w:after="0"/>
+      </w:pPr>
+      <w:r>
+        <w:rPr>
+          <w:rFonts w:ascii="Courier New" w:hAnsi="Courier New" w:eastAsia="Courier New"/>
+          <w:sz w:val="18"/>
+        </w:rPr>
+        <w:t xml:space="preserve">                |    |    |    |  consume (Flink SQL)</w:t>
+      </w:r>
+    </w:p>
+    <w:p>
+      <w:pPr>
+        <w:spacing w:before="0" w:after="0"/>
+      </w:pPr>
+      <w:r>
+        <w:rPr>
+          <w:rFonts w:ascii="Courier New" w:hAnsi="Courier New" w:eastAsia="Courier New"/>
+          <w:sz w:val="18"/>
+        </w:rPr>
+        <w:t xml:space="preserve">           +----+----+----+----+</w:t>
+      </w:r>
+    </w:p>
+    <w:p>
+      <w:pPr>
+        <w:spacing w:before="0" w:after="0"/>
+      </w:pPr>
+      <w:r>
+        <w:rPr>
+          <w:rFonts w:ascii="Courier New" w:hAnsi="Courier New" w:eastAsia="Courier New"/>
+          <w:sz w:val="18"/>
+        </w:rPr>
+        <w:t xml:space="preserve">           |    adsb_raw        |</w:t>
+      </w:r>
+    </w:p>
+    <w:p>
+      <w:pPr>
+        <w:spacing w:before="0" w:after="0"/>
+      </w:pPr>
+      <w:r>
+        <w:rPr>
+          <w:rFonts w:ascii="Courier New" w:hAnsi="Courier New" w:eastAsia="Courier New"/>
+          <w:sz w:val="18"/>
+        </w:rPr>
+        <w:t xml:space="preserve">           |   Kafka topic      |</w:t>
+      </w:r>
+    </w:p>
+    <w:p>
+      <w:pPr>
+        <w:spacing w:before="0" w:after="0"/>
+      </w:pPr>
+      <w:r>
+        <w:rPr>
+          <w:rFonts w:ascii="Courier New" w:hAnsi="Courier New" w:eastAsia="Courier New"/>
+          <w:sz w:val="18"/>
+        </w:rPr>
+        <w:t xml:space="preserve">           +--------------------+</w:t>
+      </w:r>
+    </w:p>
+    <w:p>
+      <w:pPr>
+        <w:spacing w:before="0" w:after="0"/>
+      </w:pPr>
+      <w:r>
+        <w:rPr>
+          <w:rFonts w:ascii="Courier New" w:hAnsi="Courier New" w:eastAsia="Courier New"/>
+          <w:sz w:val="18"/>
+        </w:rPr>
+        <w:t xml:space="preserve">                      v  v</w:t>
+      </w:r>
+    </w:p>
+    <w:p>
+      <w:pPr>
+        <w:spacing w:before="0" w:after="0"/>
+      </w:pPr>
+      <w:r>
+        <w:rPr>
+          <w:rFonts w:ascii="Courier New" w:hAnsi="Courier New" w:eastAsia="Courier New"/>
+          <w:sz w:val="18"/>
+        </w:rPr>
+        <w:t xml:space="preserve">                      |  |</w:t>
+      </w:r>
+    </w:p>
+    <w:p>
+      <w:pPr>
+        <w:spacing w:before="0" w:after="0"/>
+      </w:pPr>
+      <w:r>
+        <w:rPr>
+          <w:rFonts w:ascii="Courier New" w:hAnsi="Courier New" w:eastAsia="Courier New"/>
+          <w:sz w:val="18"/>
+        </w:rPr>
+        <w:t xml:space="preserve">           +----------+  +-----------------+</w:t>
+      </w:r>
+    </w:p>
+    <w:p>
+      <w:pPr>
+        <w:spacing w:before="0" w:after="0"/>
+      </w:pPr>
+      <w:r>
+        <w:rPr>
+          <w:rFonts w:ascii="Courier New" w:hAnsi="Courier New" w:eastAsia="Courier New"/>
+          <w:sz w:val="18"/>
+        </w:rPr>
+        <w:t xml:space="preserve">           |  produce JSON                |</w:t>
+      </w:r>
+    </w:p>
+    <w:p>
+      <w:pPr>
+        <w:spacing w:before="0" w:after="0"/>
+      </w:pPr>
+      <w:r>
+        <w:rPr>
+          <w:rFonts w:ascii="Courier New" w:hAnsi="Courier New" w:eastAsia="Courier New"/>
+          <w:sz w:val="18"/>
+        </w:rPr>
+        <w:t xml:space="preserve">  +--------+--------+         +--------+----------+</w:t>
+      </w:r>
+    </w:p>
+    <w:p>
+      <w:pPr>
+        <w:spacing w:before="0" w:after="0"/>
+      </w:pPr>
+      <w:r>
+        <w:rPr>
+          <w:rFonts w:ascii="Courier New" w:hAnsi="Courier New" w:eastAsia="Courier New"/>
+          <w:sz w:val="18"/>
+        </w:rPr>
+        <w:t xml:space="preserve">  | poll every 60s  |         |  4 scenarios/20s  |</w:t>
+      </w:r>
+    </w:p>
+    <w:p>
+      <w:pPr>
+        <w:spacing w:before="0" w:after="0"/>
+      </w:pPr>
+      <w:r>
+        <w:rPr>
+          <w:rFonts w:ascii="Courier New" w:hAnsi="Courier New" w:eastAsia="Courier New"/>
+          <w:sz w:val="18"/>
+        </w:rPr>
+        <w:t xml:space="preserve">  | (OpenSky OAuth2)|         |  (SIM* aircraft)  |</w:t>
+      </w:r>
+    </w:p>
+    <w:p>
+      <w:pPr>
+        <w:spacing w:before="0" w:after="0"/>
+      </w:pPr>
+      <w:r>
+        <w:rPr>
+          <w:rFonts w:ascii="Courier New" w:hAnsi="Courier New" w:eastAsia="Courier New"/>
+          <w:sz w:val="18"/>
+        </w:rPr>
+        <w:t xml:space="preserve">  | adsb-producer   |         |  adsb-simulator   |</w:t>
+      </w:r>
+    </w:p>
+    <w:p>
+      <w:pPr>
+        <w:spacing w:before="0" w:after="0"/>
+      </w:pPr>
+      <w:r>
+        <w:rPr>
+          <w:rFonts w:ascii="Courier New" w:hAnsi="Courier New" w:eastAsia="Courier New"/>
+          <w:sz w:val="18"/>
+        </w:rPr>
+        <w:t xml:space="preserve">  +------------------+         +-------------------+</w:t>
+      </w:r>
+    </w:p>
+    <w:p>
+      <w:pPr>
+        <w:spacing w:after="40"/>
+      </w:pPr>
+      <w:r>
+        <w:rPr/>
+        <w:t xml:space="preserve"/>
+      </w:r>
+    </w:p>
     <w:p>
       <w:pPr>
         <w:spacing w:after="160"/>

</xml_diff>